<commit_message>
Update heading sizes: H1/H2 → 18pt, H3 → 16pt
Co-Authored-By: Claude Opus 4.6 <noreply@anthropic.com>
</commit_message>
<xml_diff>
--- a/md2gost/templates/gost-7.32.docx
+++ b/md2gost/templates/gost-7.32.docx
@@ -38,9 +38,17 @@
       <w:pPr>
         <w:pStyle w:val="1"/>
         <w:jc w:val="left"/>
+        <w:rPr>
+          <w:sz w:val="36"/>
+          <w:szCs w:val="36"/>
+        </w:rPr>
       </w:pPr>
       <w:bookmarkStart w:id="0" w:name="heading-1"/>
       <w:r>
+        <w:rPr>
+          <w:sz w:val="36"/>
+          <w:szCs w:val="36"/>
+        </w:rPr>
         <w:t xml:space="preserve">Heading 1 </w:t>
       </w:r>
       <w:bookmarkEnd w:id="0"/>
@@ -48,9 +56,17 @@
     <w:p>
       <w:pPr>
         <w:pStyle w:val="21"/>
+        <w:rPr>
+          <w:sz w:val="36"/>
+          <w:szCs w:val="36"/>
+        </w:rPr>
       </w:pPr>
       <w:bookmarkStart w:id="1" w:name="heading-2"/>
       <w:r>
+        <w:rPr>
+          <w:sz w:val="36"/>
+          <w:szCs w:val="36"/>
+        </w:rPr>
         <w:t xml:space="preserve">Heading 2 </w:t>
       </w:r>
       <w:bookmarkEnd w:id="1"/>
@@ -59,15 +75,17 @@
       <w:pPr>
         <w:pStyle w:val="30"/>
         <w:rPr>
-          <w:i w:val="0"/>
           <w:iCs/>
+          <w:sz w:val="32"/>
+          <w:szCs w:val="32"/>
         </w:rPr>
       </w:pPr>
       <w:bookmarkStart w:id="2" w:name="heading-3"/>
       <w:r>
         <w:rPr>
-          <w:i w:val="0"/>
           <w:iCs/>
+          <w:sz w:val="32"/>
+          <w:szCs w:val="32"/>
         </w:rPr>
         <w:t>Heading 3</w:t>
       </w:r>
@@ -203,6 +221,7 @@
     <w:p>
       <w:pPr>
         <w:pStyle w:val="TableCaption"/>
+        <w:jc w:val="left"/>
       </w:pPr>
       <w:r>
         <w:t xml:space="preserve"> Table </w:t>
@@ -315,6 +334,7 @@
         <w:pStyle w:val="DefinitionTerm"/>
       </w:pPr>
       <w:r>
+        <w:lastRenderedPageBreak/>
         <w:t xml:space="preserve"> </w:t>
       </w:r>
       <w:proofErr w:type="spellStart"/>
@@ -339,7 +359,6 @@
         <w:pStyle w:val="DefinitionTerm"/>
       </w:pPr>
       <w:r>
-        <w:lastRenderedPageBreak/>
         <w:t xml:space="preserve"> </w:t>
       </w:r>
       <w:proofErr w:type="spellStart"/>
@@ -1363,7 +1382,7 @@
 </file>
 
 <file path=word/styles.xml><?xml version="1.0" encoding="utf-8"?>
-<w:styles xmlns:mc="http://schemas.openxmlformats.org/markup-compatibility/2006" xmlns:r="http://schemas.openxmlformats.org/officeDocument/2006/relationships" xmlns:w="http://schemas.openxmlformats.org/wordprocessingml/2006/main" xmlns:w14="http://schemas.microsoft.com/office/word/2010/wordml" xmlns:w15="http://schemas.microsoft.com/office/word/2012/wordml" xmlns:w16cex="http://schemas.microsoft.com/office/word/2018/wordml/cex" xmlns:w16cid="http://schemas.microsoft.com/office/word/2016/wordml/cid" xmlns:w16="http://schemas.microsoft.com/office/word/2018/wordml" xmlns:w16du="http://schemas.microsoft.com/office/word/2023/wordml/word16du" xmlns:w16sdtdh="http://schemas.microsoft.com/office/word/2020/wordml/sdtdatahash" xmlns:w16sdtfl="http://schemas.microsoft.com/office/word/2024/wordml/sdtformatlock" xmlns:w16se="http://schemas.microsoft.com/office/word/2015/wordml/symex" mc:Ignorable="w14 w15 w16se w16cid w16 w16cex w16sdtdh w16sdtfl w16du">
+<w:styles xmlns:mc="http://schemas.openxmlformats.org/markup-compatibility/2006" xmlns:w="http://schemas.openxmlformats.org/wordprocessingml/2006/main" mc:Ignorable="w14 w15 w16se w16cid w16 w16cex w16sdtdh w16sdtfl w16du">
   <w:docDefaults>
     <w:rPrDefault>
       <w:rPr>
@@ -1750,8 +1769,8 @@
       <w:rFonts w:eastAsiaTheme="majorEastAsia" w:cstheme="majorBidi"/>
       <w:b/>
       <w:bCs/>
-      <w:sz w:val="30"/>
-      <w:szCs w:val="32"/>
+      <w:sz w:val="36"/>
+      <w:szCs w:val="36"/>
     </w:rPr>
   </w:style>
   <w:style w:type="paragraph" w:styleId="21">
@@ -1774,7 +1793,8 @@
       <w:rFonts w:eastAsiaTheme="majorEastAsia" w:cstheme="majorBidi"/>
       <w:b/>
       <w:bCs/>
-      <w:szCs w:val="28"/>
+      <w:szCs w:val="36"/>
+      <w:sz w:val="36"/>
     </w:rPr>
   </w:style>
   <w:style w:type="paragraph" w:styleId="30">
@@ -1797,6 +1817,8 @@
       <w:rFonts w:eastAsiaTheme="majorEastAsia" w:cstheme="majorBidi"/>
       <w:b/>
       <w:bCs/>
+      <w:sz w:val="32"/>
+      <w:szCs w:val="32"/>
     </w:rPr>
   </w:style>
   <w:style w:type="paragraph" w:styleId="40">
@@ -2154,7 +2176,6 @@
     <w:name w:val="caption"/>
     <w:basedOn w:val="a1"/>
     <w:link w:val="af2"/>
-    <w:rPr/>
   </w:style>
   <w:style w:type="paragraph" w:customStyle="1" w:styleId="TableCaption">
     <w:name w:val="Table Caption"/>

</xml_diff>